<commit_message>
RegionList: Search box and Excel-style column filters
Co-Authored-By: Claude Opus 5.5 <noreply@anthropic.com>
</commit_message>
<xml_diff>
--- a/RegionList.docx
+++ b/RegionList.docx
@@ -134,6 +134,99 @@
       </w:r>
       <w:r>
         <w:t xml:space="preserve"> by clicking the column name.</w:t>
+      </w:r>
+    </w:p>
+    <w:p>
+      <w:pPr>
+        <w:pStyle w:val="Heading2"/>
+      </w:pPr>
+      <w:r>
+        <w:t xml:space="preserve">Search box</w:t>
+      </w:r>
+    </w:p>
+    <w:p>
+      <w:r>
+        <w:t xml:space="preserve">Type in the Search box to show only the rows that hold your text.</w:t>
+      </w:r>
+    </w:p>
+    <w:p>
+      <w:r>
+        <w:t xml:space="preserve">On the Details, Avatars and Visitors screens it looks in every column. You can type an estate name, an owner, or a DOS box name. On the Icons screen it looks at region names only. On the Users screen it looks at avatar names.</w:t>
+      </w:r>
+    </w:p>
+    <w:p>
+      <w:pPr>
+        <w:pStyle w:val="Heading2"/>
+      </w:pPr>
+      <w:r>
+        <w:t xml:space="preserve">Filtering a column</w:t>
+      </w:r>
+    </w:p>
+    <w:p>
+      <w:r>
+        <w:t xml:space="preserve">On the Details, Avatars and Visitors screens, every column heading has a small arrow at its right edge. It works like the filter arrow in Excel.</w:t>
+      </w:r>
+    </w:p>
+    <w:p>
+      <w:r>
+        <w:t xml:space="preserve">Click the column name to sort by that column. Click the arrow, or right-click the heading, to open its filter menu:</w:t>
+      </w:r>
+    </w:p>
+    <w:p>
+      <w:r>
+        <w:t xml:space="preserve">- Sort A to Z, or Sort Z to A.</w:t>
+      </w:r>
+    </w:p>
+    <w:p>
+      <w:r>
+        <w:t xml:space="preserve">- Clear Filter From the column.</w:t>
+      </w:r>
+    </w:p>
+    <w:p>
+      <w:r>
+        <w:t xml:space="preserve">- Text Filters, Number Filters or Date Filters, depending on what the column holds. For example: contains, begins with, greater than, between, top 10, above average, before, after, today, or last 7 days.</w:t>
+      </w:r>
+    </w:p>
+    <w:p>
+      <w:r>
+        <w:t xml:space="preserve">- A list of every value in the column, each with a tick box. Untick the values you want to hide. In a long list, type in the small search box to find a value.</w:t>
+      </w:r>
+    </w:p>
+    <w:p>
+      <w:r>
+        <w:t xml:space="preserve">Click OK to apply the filter.</w:t>
+      </w:r>
+    </w:p>
+    <w:p>
+      <w:r>
+        <w:t xml:space="preserve">A filtered column shows a blue funnel in place of the arrow. You can filter several columns at once. A row shows only when it passes every filter.</w:t>
+      </w:r>
+    </w:p>
+    <w:p>
+      <w:r>
+        <w:t xml:space="preserve">Right-click any cell to filter by that cell’s value, to clear the filter on that column, or to clear all filters.</w:t>
+      </w:r>
+    </w:p>
+    <w:p>
+      <w:r>
+        <w:t xml:space="preserve">On the Details screen, a Clear All Filters link appears next to the region count while any filter is on.</w:t>
+      </w:r>
+    </w:p>
+    <w:p>
+      <w:r>
+        <w:t xml:space="preserve">Filters are not saved. They are cleared when you close the Region List.</w:t>
+      </w:r>
+    </w:p>
+    <w:p>
+      <w:r>
+        <w:rPr>
+          <w:b/>
+          <w:bCs/>
+        </w:rPr>
+        <w:t xml:space="preserve">CAUTION:</w:t>
+      </w:r>
+      <w:r>
+        <w:t xml:space="preserve"> The Select All/None box and the Export button only act on the regions you can see. Clear the filters first if you mean every region.</w:t>
       </w:r>
     </w:p>
     <w:p>

</xml_diff>